<commit_message>
setp up GPT code
</commit_message>
<xml_diff>
--- a/docs/NYU server & output storage.docx
+++ b/docs/NYU server & output storage.docx
@@ -100,16 +100,8 @@
         <w:rPr>
           <w:lang w:val="en-US"/>
         </w:rPr>
-        <w:t xml:space="preserve">ssh </w:t>
-      </w:r>
-      <w:proofErr w:type="spellStart"/>
-      <w:r>
-        <w:rPr>
-          <w:lang w:val="en-US"/>
-        </w:rPr>
-        <w:t>greene</w:t>
-      </w:r>
-      <w:proofErr w:type="spellEnd"/>
+        <w:t>ssh greene</w:t>
+      </w:r>
     </w:p>
     <w:p>
       <w:pPr>
@@ -159,19 +151,11 @@
           <w:lang w:val="en-US"/>
         </w:rPr>
       </w:pPr>
-      <w:proofErr w:type="spellStart"/>
-      <w:r>
-        <w:rPr>
-          <w:lang w:val="en-US"/>
-        </w:rPr>
-        <w:t>sbatch</w:t>
-      </w:r>
-      <w:proofErr w:type="spellEnd"/>
-      <w:r>
-        <w:rPr>
-          <w:lang w:val="en-US"/>
-        </w:rPr>
-        <w:t xml:space="preserve"> --time=02:00:00 --mem=4GB --wrap "sleep infinity"</w:t>
+      <w:r>
+        <w:rPr>
+          <w:lang w:val="en-US"/>
+        </w:rPr>
+        <w:t>sbatch --time=02:00:00 --mem=4GB --wrap "sleep infinity"</w:t>
       </w:r>
     </w:p>
     <w:p>
@@ -208,19 +192,11 @@
           <w:lang w:val="en-US"/>
         </w:rPr>
       </w:pPr>
-      <w:proofErr w:type="spellStart"/>
-      <w:r>
-        <w:rPr>
-          <w:lang w:val="en-US"/>
-        </w:rPr>
-        <w:t>squeue</w:t>
-      </w:r>
-      <w:proofErr w:type="spellEnd"/>
-      <w:r>
-        <w:rPr>
-          <w:lang w:val="en-US"/>
-        </w:rPr>
-        <w:t xml:space="preserve"> -u $USER</w:t>
+      <w:r>
+        <w:rPr>
+          <w:lang w:val="en-US"/>
+        </w:rPr>
+        <w:t>squeue -u $USER</w:t>
       </w:r>
     </w:p>
     <w:p>
@@ -330,661 +306,393 @@
           <w:rFonts w:hint="eastAsia"/>
           <w:lang w:val="en-US"/>
         </w:rPr>
-        <w:t xml:space="preserve"> </w:t>
-      </w:r>
-      <w:proofErr w:type="spellStart"/>
+        <w:t xml:space="preserve"> greene-compute </w:t>
+      </w:r>
       <w:r>
         <w:rPr>
           <w:rFonts w:hint="eastAsia"/>
           <w:lang w:val="en-US"/>
         </w:rPr>
-        <w:t>greene</w:t>
-      </w:r>
-      <w:proofErr w:type="spellEnd"/>
+        <w:t>的</w:t>
+      </w:r>
       <w:r>
         <w:rPr>
           <w:rFonts w:hint="eastAsia"/>
           <w:lang w:val="en-US"/>
         </w:rPr>
-        <w:t xml:space="preserve">-compute </w:t>
+        <w:t xml:space="preserve"> HostName </w:t>
       </w:r>
       <w:r>
         <w:rPr>
           <w:rFonts w:hint="eastAsia"/>
           <w:lang w:val="en-US"/>
         </w:rPr>
-        <w:t>的</w:t>
+        <w:t>为</w:t>
       </w:r>
       <w:r>
         <w:rPr>
           <w:rFonts w:hint="eastAsia"/>
           <w:lang w:val="en-US"/>
         </w:rPr>
-        <w:t xml:space="preserve"> </w:t>
-      </w:r>
-      <w:proofErr w:type="spellStart"/>
+        <w:t xml:space="preserve"> cm0</w:t>
+      </w:r>
+      <w:r>
+        <w:rPr>
+          <w:lang w:val="en-US"/>
+        </w:rPr>
+        <w:t>29</w:t>
+      </w:r>
+    </w:p>
+    <w:p>
+      <w:pPr>
+        <w:rPr>
+          <w:lang w:val="en-US"/>
+        </w:rPr>
+      </w:pPr>
+      <w:r>
+        <w:rPr>
+          <w:lang w:val="en-US"/>
+        </w:rPr>
+        <w:t>nano ~/.ssh/config</w:t>
+      </w:r>
+    </w:p>
+    <w:p>
+      <w:pPr>
+        <w:rPr>
+          <w:lang w:val="en-US"/>
+        </w:rPr>
+      </w:pPr>
+    </w:p>
+    <w:p>
+      <w:pPr>
+        <w:rPr>
+          <w:lang w:val="en-US"/>
+        </w:rPr>
+      </w:pPr>
+    </w:p>
+    <w:p>
+      <w:pPr>
+        <w:rPr>
+          <w:lang w:val="en-US"/>
+        </w:rPr>
+      </w:pPr>
+    </w:p>
+    <w:p>
+      <w:pPr>
+        <w:rPr>
+          <w:lang w:val="en-US"/>
+        </w:rPr>
+      </w:pPr>
+      <w:r>
+        <w:rPr>
+          <w:lang w:val="en-US"/>
+        </w:rPr>
+        <w:t>Host greene</w:t>
+      </w:r>
+    </w:p>
+    <w:p>
+      <w:pPr>
+        <w:rPr>
+          <w:lang w:val="en-US"/>
+        </w:rPr>
+      </w:pPr>
+      <w:r>
+        <w:rPr>
+          <w:lang w:val="en-US"/>
+        </w:rPr>
+        <w:t xml:space="preserve">  HostName greene.hpc.nyu.edu</w:t>
+      </w:r>
+    </w:p>
+    <w:p>
+      <w:pPr>
+        <w:rPr>
+          <w:lang w:val="en-US"/>
+        </w:rPr>
+      </w:pPr>
+      <w:r>
+        <w:rPr>
+          <w:lang w:val="en-US"/>
+        </w:rPr>
+        <w:t xml:space="preserve">  User qd2177</w:t>
+      </w:r>
+    </w:p>
+    <w:p>
+      <w:pPr>
+        <w:rPr>
+          <w:lang w:val="en-US"/>
+        </w:rPr>
+      </w:pPr>
+      <w:r>
+        <w:rPr>
+          <w:lang w:val="en-US"/>
+        </w:rPr>
+        <w:t xml:space="preserve">  IdentityFile ~/.ssh/id_ed25519_greene</w:t>
+      </w:r>
+    </w:p>
+    <w:p>
+      <w:pPr>
+        <w:rPr>
+          <w:lang w:val="en-US"/>
+        </w:rPr>
+      </w:pPr>
+      <w:r>
+        <w:rPr>
+          <w:lang w:val="en-US"/>
+        </w:rPr>
+        <w:t xml:space="preserve">  ServerAliveInterval 60</w:t>
+      </w:r>
+    </w:p>
+    <w:p>
+      <w:pPr>
+        <w:rPr>
+          <w:lang w:val="en-US"/>
+        </w:rPr>
+      </w:pPr>
+      <w:r>
+        <w:rPr>
+          <w:lang w:val="en-US"/>
+        </w:rPr>
+        <w:t xml:space="preserve">  ServerAliveCountMax 120</w:t>
+      </w:r>
+    </w:p>
+    <w:p>
+      <w:pPr>
+        <w:rPr>
+          <w:lang w:val="en-US"/>
+        </w:rPr>
+      </w:pPr>
+      <w:r>
+        <w:rPr>
+          <w:lang w:val="en-US"/>
+        </w:rPr>
+        <w:lastRenderedPageBreak/>
+        <w:t xml:space="preserve">  StrictHostKeyChecking no</w:t>
+      </w:r>
+    </w:p>
+    <w:p>
+      <w:pPr>
+        <w:rPr>
+          <w:lang w:val="en-US"/>
+        </w:rPr>
+      </w:pPr>
+      <w:r>
+        <w:rPr>
+          <w:lang w:val="en-US"/>
+        </w:rPr>
+        <w:t xml:space="preserve">  UserKnownHostsFile /dev/null</w:t>
+      </w:r>
+    </w:p>
+    <w:p>
+      <w:pPr>
+        <w:rPr>
+          <w:lang w:val="en-US"/>
+        </w:rPr>
+      </w:pPr>
+      <w:r>
+        <w:rPr>
+          <w:lang w:val="en-US"/>
+        </w:rPr>
+        <w:t xml:space="preserve">  LogLevel ERROR</w:t>
+      </w:r>
+    </w:p>
+    <w:p>
+      <w:pPr>
+        <w:rPr>
+          <w:lang w:val="en-US"/>
+        </w:rPr>
+      </w:pPr>
+    </w:p>
+    <w:p>
+      <w:pPr>
+        <w:rPr>
+          <w:lang w:val="en-US"/>
+        </w:rPr>
+      </w:pPr>
+      <w:r>
+        <w:rPr>
+          <w:lang w:val="en-US"/>
+        </w:rPr>
+        <w:t>Host greene-compute</w:t>
+      </w:r>
+    </w:p>
+    <w:p>
+      <w:pPr>
+        <w:rPr>
+          <w:lang w:val="en-US"/>
+        </w:rPr>
+      </w:pPr>
+      <w:r>
+        <w:rPr>
+          <w:lang w:val="en-US"/>
+        </w:rPr>
+        <w:t xml:space="preserve">  HostName cm040</w:t>
+      </w:r>
+    </w:p>
+    <w:p>
+      <w:pPr>
+        <w:rPr>
+          <w:lang w:val="en-US"/>
+        </w:rPr>
+      </w:pPr>
+      <w:r>
+        <w:rPr>
+          <w:lang w:val="en-US"/>
+        </w:rPr>
+        <w:t xml:space="preserve">  User qd2177</w:t>
+      </w:r>
+    </w:p>
+    <w:p>
+      <w:pPr>
+        <w:rPr>
+          <w:lang w:val="en-US"/>
+        </w:rPr>
+      </w:pPr>
+      <w:r>
+        <w:rPr>
+          <w:lang w:val="en-US"/>
+        </w:rPr>
+        <w:t xml:space="preserve">  IdentityFile ~/.ssh/id_ed25519_greene</w:t>
+      </w:r>
+    </w:p>
+    <w:p>
+      <w:pPr>
+        <w:rPr>
+          <w:lang w:val="en-US"/>
+        </w:rPr>
+      </w:pPr>
+      <w:r>
+        <w:rPr>
+          <w:lang w:val="en-US"/>
+        </w:rPr>
+        <w:t xml:space="preserve">  ProxyJump qd2177@greene.hpc.nyu.edu</w:t>
+      </w:r>
+    </w:p>
+    <w:p>
+      <w:pPr>
+        <w:rPr>
+          <w:lang w:val="en-US"/>
+        </w:rPr>
+      </w:pPr>
+      <w:r>
+        <w:rPr>
+          <w:lang w:val="en-US"/>
+        </w:rPr>
+        <w:t xml:space="preserve">  StrictHostKeyChecking no</w:t>
+      </w:r>
+    </w:p>
+    <w:p>
+      <w:pPr>
+        <w:rPr>
+          <w:lang w:val="en-US"/>
+        </w:rPr>
+      </w:pPr>
+      <w:r>
+        <w:rPr>
+          <w:lang w:val="en-US"/>
+        </w:rPr>
+        <w:t xml:space="preserve">  UserKnownHostsFile /dev/null</w:t>
+      </w:r>
+    </w:p>
+    <w:p>
+      <w:pPr>
+        <w:rPr>
+          <w:lang w:val="en-US"/>
+        </w:rPr>
+      </w:pPr>
+      <w:r>
+        <w:rPr>
+          <w:lang w:val="en-US"/>
+        </w:rPr>
+        <w:t xml:space="preserve">  LogLevel ERROR</w:t>
+      </w:r>
+    </w:p>
+    <w:p>
+      <w:pPr>
+        <w:rPr>
+          <w:lang w:val="en-US"/>
+        </w:rPr>
+      </w:pPr>
+    </w:p>
+    <w:p>
+      <w:pPr>
+        <w:rPr>
+          <w:lang w:val="en-US"/>
+        </w:rPr>
+      </w:pPr>
+    </w:p>
+    <w:p>
+      <w:pPr>
+        <w:rPr>
+          <w:lang w:val="en-US"/>
+        </w:rPr>
+      </w:pPr>
       <w:r>
         <w:rPr>
           <w:rFonts w:hint="eastAsia"/>
           <w:lang w:val="en-US"/>
         </w:rPr>
-        <w:t>HostName</w:t>
-      </w:r>
-      <w:proofErr w:type="spellEnd"/>
+        <w:t xml:space="preserve"># 5) VS Code </w:t>
+      </w:r>
       <w:r>
         <w:rPr>
           <w:rFonts w:hint="eastAsia"/>
           <w:lang w:val="en-US"/>
         </w:rPr>
-        <w:t xml:space="preserve"> </w:t>
+        <w:t>→</w:t>
       </w:r>
       <w:r>
         <w:rPr>
           <w:rFonts w:hint="eastAsia"/>
           <w:lang w:val="en-US"/>
         </w:rPr>
-        <w:t>为</w:t>
+        <w:t xml:space="preserve"> Remote-SSH </w:t>
       </w:r>
       <w:r>
         <w:rPr>
           <w:rFonts w:hint="eastAsia"/>
           <w:lang w:val="en-US"/>
         </w:rPr>
-        <w:t xml:space="preserve"> cm0</w:t>
-      </w:r>
-      <w:r>
-        <w:rPr>
-          <w:lang w:val="en-US"/>
-        </w:rPr>
-        <w:t>29</w:t>
-      </w:r>
-    </w:p>
-    <w:p>
-      <w:pPr>
-        <w:rPr>
-          <w:lang w:val="en-US"/>
-        </w:rPr>
-      </w:pPr>
-      <w:r>
-        <w:rPr>
-          <w:lang w:val="en-US"/>
-        </w:rPr>
-        <w:t>nano ~/.ssh/config</w:t>
-      </w:r>
-    </w:p>
-    <w:p>
-      <w:pPr>
-        <w:rPr>
-          <w:lang w:val="en-US"/>
-        </w:rPr>
-      </w:pPr>
-    </w:p>
-    <w:p>
-      <w:pPr>
-        <w:rPr>
-          <w:lang w:val="en-US"/>
-        </w:rPr>
-      </w:pPr>
-    </w:p>
-    <w:p>
-      <w:pPr>
-        <w:rPr>
-          <w:lang w:val="en-US"/>
-        </w:rPr>
-      </w:pPr>
-    </w:p>
-    <w:p>
-      <w:pPr>
-        <w:rPr>
-          <w:lang w:val="en-US"/>
-        </w:rPr>
-      </w:pPr>
-      <w:r>
-        <w:rPr>
-          <w:lang w:val="en-US"/>
-        </w:rPr>
-        <w:t xml:space="preserve">Host </w:t>
-      </w:r>
-      <w:proofErr w:type="spellStart"/>
-      <w:r>
-        <w:rPr>
-          <w:lang w:val="en-US"/>
-        </w:rPr>
-        <w:t>greene</w:t>
-      </w:r>
-      <w:proofErr w:type="spellEnd"/>
-    </w:p>
-    <w:p>
-      <w:pPr>
-        <w:rPr>
-          <w:lang w:val="en-US"/>
-        </w:rPr>
-      </w:pPr>
-      <w:r>
-        <w:rPr>
-          <w:lang w:val="en-US"/>
-        </w:rPr>
-        <w:t xml:space="preserve">  </w:t>
-      </w:r>
-      <w:proofErr w:type="spellStart"/>
-      <w:r>
-        <w:rPr>
-          <w:lang w:val="en-US"/>
-        </w:rPr>
-        <w:t>HostName</w:t>
-      </w:r>
-      <w:proofErr w:type="spellEnd"/>
-      <w:r>
-        <w:rPr>
-          <w:lang w:val="en-US"/>
-        </w:rPr>
-        <w:t xml:space="preserve"> greene.hpc.nyu.edu</w:t>
-      </w:r>
-    </w:p>
-    <w:p>
-      <w:pPr>
-        <w:rPr>
-          <w:lang w:val="en-US"/>
-        </w:rPr>
-      </w:pPr>
-      <w:r>
-        <w:rPr>
-          <w:lang w:val="en-US"/>
-        </w:rPr>
-        <w:t xml:space="preserve">  User qd2177</w:t>
-      </w:r>
-    </w:p>
-    <w:p>
-      <w:pPr>
-        <w:rPr>
-          <w:lang w:val="en-US"/>
-        </w:rPr>
-      </w:pPr>
-      <w:r>
-        <w:rPr>
-          <w:lang w:val="en-US"/>
-        </w:rPr>
-        <w:t xml:space="preserve">  </w:t>
-      </w:r>
-      <w:proofErr w:type="spellStart"/>
-      <w:r>
-        <w:rPr>
-          <w:lang w:val="en-US"/>
-        </w:rPr>
-        <w:t>IdentityFile</w:t>
-      </w:r>
-      <w:proofErr w:type="spellEnd"/>
-      <w:r>
-        <w:rPr>
-          <w:lang w:val="en-US"/>
-        </w:rPr>
-        <w:t xml:space="preserve"> ~/.ssh/id_ed25519_greene</w:t>
-      </w:r>
-    </w:p>
-    <w:p>
-      <w:pPr>
-        <w:rPr>
-          <w:lang w:val="en-US"/>
-        </w:rPr>
-      </w:pPr>
-      <w:r>
-        <w:rPr>
-          <w:lang w:val="en-US"/>
-        </w:rPr>
-        <w:t xml:space="preserve">  </w:t>
-      </w:r>
-      <w:proofErr w:type="spellStart"/>
-      <w:r>
-        <w:rPr>
-          <w:lang w:val="en-US"/>
-        </w:rPr>
-        <w:t>ServerAliveInterval</w:t>
-      </w:r>
-      <w:proofErr w:type="spellEnd"/>
-      <w:r>
-        <w:rPr>
-          <w:lang w:val="en-US"/>
-        </w:rPr>
-        <w:t xml:space="preserve"> 60</w:t>
-      </w:r>
-    </w:p>
-    <w:p>
-      <w:pPr>
-        <w:rPr>
-          <w:lang w:val="en-US"/>
-        </w:rPr>
-      </w:pPr>
-      <w:r>
-        <w:rPr>
-          <w:lang w:val="en-US"/>
-        </w:rPr>
-        <w:t xml:space="preserve">  </w:t>
-      </w:r>
-      <w:proofErr w:type="spellStart"/>
-      <w:r>
-        <w:rPr>
-          <w:lang w:val="en-US"/>
-        </w:rPr>
-        <w:t>ServerAliveCountMax</w:t>
-      </w:r>
-      <w:proofErr w:type="spellEnd"/>
-      <w:r>
-        <w:rPr>
-          <w:lang w:val="en-US"/>
-        </w:rPr>
-        <w:t xml:space="preserve"> 120</w:t>
-      </w:r>
-    </w:p>
-    <w:p>
-      <w:pPr>
-        <w:rPr>
-          <w:lang w:val="en-US"/>
-        </w:rPr>
-      </w:pPr>
-      <w:r>
-        <w:rPr>
-          <w:lang w:val="en-US"/>
-        </w:rPr>
-        <w:lastRenderedPageBreak/>
-        <w:t xml:space="preserve">  </w:t>
-      </w:r>
-      <w:proofErr w:type="spellStart"/>
-      <w:r>
-        <w:rPr>
-          <w:lang w:val="en-US"/>
-        </w:rPr>
-        <w:t>StrictHostKeyChecking</w:t>
-      </w:r>
-      <w:proofErr w:type="spellEnd"/>
-      <w:r>
-        <w:rPr>
-          <w:lang w:val="en-US"/>
-        </w:rPr>
-        <w:t xml:space="preserve"> no</w:t>
-      </w:r>
-    </w:p>
-    <w:p>
-      <w:pPr>
-        <w:rPr>
-          <w:lang w:val="en-US"/>
-        </w:rPr>
-      </w:pPr>
-      <w:r>
-        <w:rPr>
-          <w:lang w:val="en-US"/>
-        </w:rPr>
-        <w:t xml:space="preserve">  </w:t>
-      </w:r>
-      <w:proofErr w:type="spellStart"/>
-      <w:r>
-        <w:rPr>
-          <w:lang w:val="en-US"/>
-        </w:rPr>
-        <w:t>UserKnownHostsFile</w:t>
-      </w:r>
-      <w:proofErr w:type="spellEnd"/>
-      <w:r>
-        <w:rPr>
-          <w:lang w:val="en-US"/>
-        </w:rPr>
-        <w:t xml:space="preserve"> /dev/null</w:t>
-      </w:r>
-    </w:p>
-    <w:p>
-      <w:pPr>
-        <w:rPr>
-          <w:lang w:val="en-US"/>
-        </w:rPr>
-      </w:pPr>
-      <w:r>
-        <w:rPr>
-          <w:lang w:val="en-US"/>
-        </w:rPr>
-        <w:t xml:space="preserve">  </w:t>
-      </w:r>
-      <w:proofErr w:type="spellStart"/>
-      <w:r>
-        <w:rPr>
-          <w:lang w:val="en-US"/>
-        </w:rPr>
-        <w:t>LogLevel</w:t>
-      </w:r>
-      <w:proofErr w:type="spellEnd"/>
-      <w:r>
-        <w:rPr>
-          <w:lang w:val="en-US"/>
-        </w:rPr>
-        <w:t xml:space="preserve"> ERROR</w:t>
-      </w:r>
-    </w:p>
-    <w:p>
-      <w:pPr>
-        <w:rPr>
-          <w:lang w:val="en-US"/>
-        </w:rPr>
-      </w:pPr>
-    </w:p>
-    <w:p>
-      <w:pPr>
-        <w:rPr>
-          <w:lang w:val="en-US"/>
-        </w:rPr>
-      </w:pPr>
-      <w:r>
-        <w:rPr>
-          <w:lang w:val="en-US"/>
-        </w:rPr>
-        <w:t xml:space="preserve">Host </w:t>
-      </w:r>
-      <w:proofErr w:type="spellStart"/>
-      <w:r>
-        <w:rPr>
-          <w:lang w:val="en-US"/>
-        </w:rPr>
-        <w:t>greene</w:t>
-      </w:r>
-      <w:proofErr w:type="spellEnd"/>
-      <w:r>
-        <w:rPr>
-          <w:lang w:val="en-US"/>
-        </w:rPr>
-        <w:t>-compute</w:t>
-      </w:r>
-    </w:p>
-    <w:p>
-      <w:pPr>
-        <w:rPr>
-          <w:lang w:val="en-US"/>
-        </w:rPr>
-      </w:pPr>
-      <w:r>
-        <w:rPr>
-          <w:lang w:val="en-US"/>
-        </w:rPr>
-        <w:t xml:space="preserve">  </w:t>
-      </w:r>
-      <w:proofErr w:type="spellStart"/>
-      <w:r>
-        <w:rPr>
-          <w:lang w:val="en-US"/>
-        </w:rPr>
-        <w:t>HostName</w:t>
-      </w:r>
-      <w:proofErr w:type="spellEnd"/>
-      <w:r>
-        <w:rPr>
-          <w:lang w:val="en-US"/>
-        </w:rPr>
-        <w:t xml:space="preserve"> cm040</w:t>
-      </w:r>
-    </w:p>
-    <w:p>
-      <w:pPr>
-        <w:rPr>
-          <w:lang w:val="en-US"/>
-        </w:rPr>
-      </w:pPr>
-      <w:r>
-        <w:rPr>
-          <w:lang w:val="en-US"/>
-        </w:rPr>
-        <w:t xml:space="preserve">  User qd2177</w:t>
-      </w:r>
-    </w:p>
-    <w:p>
-      <w:pPr>
-        <w:rPr>
-          <w:lang w:val="en-US"/>
-        </w:rPr>
-      </w:pPr>
-      <w:r>
-        <w:rPr>
-          <w:lang w:val="en-US"/>
-        </w:rPr>
-        <w:t xml:space="preserve">  </w:t>
-      </w:r>
-      <w:proofErr w:type="spellStart"/>
-      <w:r>
-        <w:rPr>
-          <w:lang w:val="en-US"/>
-        </w:rPr>
-        <w:t>IdentityFile</w:t>
-      </w:r>
-      <w:proofErr w:type="spellEnd"/>
-      <w:r>
-        <w:rPr>
-          <w:lang w:val="en-US"/>
-        </w:rPr>
-        <w:t xml:space="preserve"> ~/.ssh/id_ed25519_greene</w:t>
-      </w:r>
-    </w:p>
-    <w:p>
-      <w:pPr>
-        <w:rPr>
-          <w:lang w:val="en-US"/>
-        </w:rPr>
-      </w:pPr>
-      <w:r>
-        <w:rPr>
-          <w:lang w:val="en-US"/>
-        </w:rPr>
-        <w:t xml:space="preserve">  </w:t>
-      </w:r>
-      <w:proofErr w:type="spellStart"/>
-      <w:r>
-        <w:rPr>
-          <w:lang w:val="en-US"/>
-        </w:rPr>
-        <w:t>ProxyJump</w:t>
-      </w:r>
-      <w:proofErr w:type="spellEnd"/>
-      <w:r>
-        <w:rPr>
-          <w:lang w:val="en-US"/>
-        </w:rPr>
-        <w:t xml:space="preserve"> qd2177@greene.hpc.nyu.edu</w:t>
-      </w:r>
-    </w:p>
-    <w:p>
-      <w:pPr>
-        <w:rPr>
-          <w:lang w:val="en-US"/>
-        </w:rPr>
-      </w:pPr>
-      <w:r>
-        <w:rPr>
-          <w:lang w:val="en-US"/>
-        </w:rPr>
-        <w:t xml:space="preserve">  </w:t>
-      </w:r>
-      <w:proofErr w:type="spellStart"/>
-      <w:r>
-        <w:rPr>
-          <w:lang w:val="en-US"/>
-        </w:rPr>
-        <w:t>StrictHostKeyChecking</w:t>
-      </w:r>
-      <w:proofErr w:type="spellEnd"/>
-      <w:r>
-        <w:rPr>
-          <w:lang w:val="en-US"/>
-        </w:rPr>
-        <w:t xml:space="preserve"> no</w:t>
-      </w:r>
-    </w:p>
-    <w:p>
-      <w:pPr>
-        <w:rPr>
-          <w:lang w:val="en-US"/>
-        </w:rPr>
-      </w:pPr>
-      <w:r>
-        <w:rPr>
-          <w:lang w:val="en-US"/>
-        </w:rPr>
-        <w:t xml:space="preserve">  </w:t>
-      </w:r>
-      <w:proofErr w:type="spellStart"/>
-      <w:r>
-        <w:rPr>
-          <w:lang w:val="en-US"/>
-        </w:rPr>
-        <w:t>UserKnownHostsFile</w:t>
-      </w:r>
-      <w:proofErr w:type="spellEnd"/>
-      <w:r>
-        <w:rPr>
-          <w:lang w:val="en-US"/>
-        </w:rPr>
-        <w:t xml:space="preserve"> /dev/null</w:t>
-      </w:r>
-    </w:p>
-    <w:p>
-      <w:pPr>
-        <w:rPr>
-          <w:lang w:val="en-US"/>
-        </w:rPr>
-      </w:pPr>
-      <w:r>
-        <w:rPr>
-          <w:lang w:val="en-US"/>
-        </w:rPr>
-        <w:t xml:space="preserve">  </w:t>
-      </w:r>
-      <w:proofErr w:type="spellStart"/>
-      <w:r>
-        <w:rPr>
-          <w:lang w:val="en-US"/>
-        </w:rPr>
-        <w:t>LogLevel</w:t>
-      </w:r>
-      <w:proofErr w:type="spellEnd"/>
-      <w:r>
-        <w:rPr>
-          <w:lang w:val="en-US"/>
-        </w:rPr>
-        <w:t xml:space="preserve"> ERROR</w:t>
-      </w:r>
-    </w:p>
-    <w:p>
-      <w:pPr>
-        <w:rPr>
-          <w:lang w:val="en-US"/>
-        </w:rPr>
-      </w:pPr>
-    </w:p>
-    <w:p>
-      <w:pPr>
-        <w:rPr>
-          <w:lang w:val="en-US"/>
-        </w:rPr>
-      </w:pPr>
-    </w:p>
-    <w:p>
-      <w:pPr>
-        <w:rPr>
-          <w:lang w:val="en-US"/>
-        </w:rPr>
-      </w:pPr>
+        <w:t>→</w:t>
+      </w:r>
       <w:r>
         <w:rPr>
           <w:rFonts w:hint="eastAsia"/>
           <w:lang w:val="en-US"/>
         </w:rPr>
-        <w:t xml:space="preserve"># 5) VS Code </w:t>
-      </w:r>
-      <w:r>
-        <w:rPr>
-          <w:rFonts w:hint="eastAsia"/>
-          <w:lang w:val="en-US"/>
-        </w:rPr>
-        <w:t>→</w:t>
-      </w:r>
-      <w:r>
-        <w:rPr>
-          <w:rFonts w:hint="eastAsia"/>
-          <w:lang w:val="en-US"/>
-        </w:rPr>
-        <w:t xml:space="preserve"> Remote-SSH </w:t>
-      </w:r>
-      <w:r>
-        <w:rPr>
-          <w:rFonts w:hint="eastAsia"/>
-          <w:lang w:val="en-US"/>
-        </w:rPr>
-        <w:t>→</w:t>
-      </w:r>
-      <w:r>
-        <w:rPr>
-          <w:rFonts w:hint="eastAsia"/>
-          <w:lang w:val="en-US"/>
-        </w:rPr>
-        <w:t xml:space="preserve"> </w:t>
-      </w:r>
-      <w:proofErr w:type="spellStart"/>
-      <w:r>
-        <w:rPr>
-          <w:rFonts w:hint="eastAsia"/>
-          <w:lang w:val="en-US"/>
-        </w:rPr>
-        <w:t>greene</w:t>
-      </w:r>
-      <w:proofErr w:type="spellEnd"/>
-      <w:r>
-        <w:rPr>
-          <w:rFonts w:hint="eastAsia"/>
-          <w:lang w:val="en-US"/>
-        </w:rPr>
-        <w:t>-compute</w:t>
-      </w:r>
-    </w:p>
-    <w:p>
-      <w:pPr>
-        <w:rPr>
-          <w:lang w:val="en-US"/>
-        </w:rPr>
-      </w:pPr>
-    </w:p>
-    <w:p>
-      <w:pPr>
-        <w:rPr>
-          <w:lang w:val="en-US"/>
-        </w:rPr>
-      </w:pPr>
-      <w:proofErr w:type="gramStart"/>
-      <w:r>
-        <w:rPr>
-          <w:lang w:val="en-US"/>
-        </w:rPr>
-        <w:t>#(</w:t>
-      </w:r>
-      <w:proofErr w:type="gramEnd"/>
-      <w:r>
-        <w:rPr>
-          <w:lang w:val="en-US"/>
-        </w:rPr>
-        <w:t>6) kill session:</w:t>
-      </w:r>
-    </w:p>
-    <w:p>
-      <w:pPr>
-        <w:rPr>
-          <w:lang w:val="en-US"/>
-        </w:rPr>
-      </w:pPr>
-      <w:proofErr w:type="spellStart"/>
-      <w:r>
-        <w:rPr>
-          <w:lang w:val="en-US"/>
-        </w:rPr>
-        <w:t>scancel</w:t>
-      </w:r>
-      <w:proofErr w:type="spellEnd"/>
-      <w:r>
-        <w:rPr>
-          <w:lang w:val="en-US"/>
-        </w:rPr>
-        <w:t xml:space="preserve"> 1572045 1572047 1572082</w:t>
+        <w:t xml:space="preserve"> greene-compute</w:t>
+      </w:r>
+    </w:p>
+    <w:p>
+      <w:pPr>
+        <w:rPr>
+          <w:lang w:val="en-US"/>
+        </w:rPr>
+      </w:pPr>
+    </w:p>
+    <w:p>
+      <w:pPr>
+        <w:rPr>
+          <w:lang w:val="en-US"/>
+        </w:rPr>
+      </w:pPr>
+      <w:r>
+        <w:rPr>
+          <w:lang w:val="en-US"/>
+        </w:rPr>
+        <w:t>#(6) kill session:</w:t>
+      </w:r>
+    </w:p>
+    <w:p>
+      <w:pPr>
+        <w:rPr>
+          <w:lang w:val="en-US"/>
+        </w:rPr>
+      </w:pPr>
+      <w:r>
+        <w:rPr>
+          <w:lang w:val="en-US"/>
+        </w:rPr>
+        <w:t>scancel 1572045 1572047 1572082</w:t>
       </w:r>
     </w:p>
     <w:p>
@@ -1017,21 +725,7 @@
         <w:rPr>
           <w:lang w:val="en-US"/>
         </w:rPr>
-        <w:t xml:space="preserve">PYTHONPATH=/scratch/qd2177/research/Digital-Twin-Simulation </w:t>
-      </w:r>
-      <w:proofErr w:type="spellStart"/>
-      <w:r>
-        <w:rPr>
-          <w:lang w:val="en-US"/>
-        </w:rPr>
-        <w:t>nohup</w:t>
-      </w:r>
-      <w:proofErr w:type="spellEnd"/>
-      <w:r>
-        <w:rPr>
-          <w:lang w:val="en-US"/>
-        </w:rPr>
-        <w:t xml:space="preserve"> bash -c "echo y | python -u notebooks/demo_full_pipeline.py" &gt; log1104.txt 2&gt;&amp;1 &amp;</w:t>
+        <w:t>PYTHONPATH=/scratch/qd2177/research/Digital-Twin-Simulation nohup bash -c "echo y | python -u notebooks/demo_full_pipeline.py" &gt; log1104.txt 2&gt;&amp;1 &amp;</w:t>
       </w:r>
     </w:p>
     <w:p>
@@ -1114,6 +808,640 @@
         </w:rPr>
         <w:t>demo_full_pipeline.py</w:t>
       </w:r>
+    </w:p>
+    <w:p>
+      <w:pPr>
+        <w:rPr>
+          <w:lang w:val="en-US"/>
+        </w:rPr>
+      </w:pPr>
+    </w:p>
+    <w:p>
+      <w:pPr>
+        <w:rPr>
+          <w:lang w:val="en-US"/>
+        </w:rPr>
+      </w:pPr>
+    </w:p>
+    <w:p>
+      <w:pPr>
+        <w:rPr>
+          <w:lang w:val="en-US"/>
+        </w:rPr>
+      </w:pPr>
+      <w:r>
+        <w:rPr>
+          <w:lang w:val="en-US"/>
+        </w:rPr>
+        <w:t>Hi Gabrielle,</w:t>
+      </w:r>
+    </w:p>
+    <w:p>
+      <w:pPr>
+        <w:rPr>
+          <w:lang w:val="en-US"/>
+        </w:rPr>
+      </w:pPr>
+      <w:r>
+        <w:rPr>
+          <w:lang w:val="en-US"/>
+        </w:rPr>
+        <w:t>Thank you for your emai</w:t>
+      </w:r>
+      <w:r>
+        <w:rPr>
+          <w:lang w:val="en-US"/>
+        </w:rPr>
+        <w:t>l!</w:t>
+      </w:r>
+      <w:r>
+        <w:rPr>
+          <w:lang w:val="en-US"/>
+        </w:rPr>
+        <w:t xml:space="preserve"> Yes, I would be available to be onsite as long as the procedures are settled.</w:t>
+      </w:r>
+    </w:p>
+    <w:p>
+      <w:pPr>
+        <w:tabs>
+          <w:tab w:val="num" w:pos="720"/>
+        </w:tabs>
+        <w:rPr>
+          <w:lang w:val="en-US"/>
+        </w:rPr>
+      </w:pPr>
+      <w:r>
+        <w:rPr>
+          <w:lang w:val="en-US"/>
+        </w:rPr>
+        <w:t>The</w:t>
+      </w:r>
+      <w:r>
+        <w:rPr>
+          <w:lang w:val="en-US"/>
+        </w:rPr>
+        <w:t xml:space="preserve"> CPT process at NYU seems quite standard, but I will also reach out to the office to ask if there are any specific procedures I should be aware of. I'll keep you posted.</w:t>
+      </w:r>
+      <w:r>
+        <w:rPr>
+          <w:lang w:val="en-US"/>
+        </w:rPr>
+        <w:t xml:space="preserve"> </w:t>
+      </w:r>
+      <w:r>
+        <w:rPr>
+          <w:lang w:val="en-US"/>
+        </w:rPr>
+        <w:t xml:space="preserve">According to the requirements, </w:t>
+      </w:r>
+      <w:r>
+        <w:rPr>
+          <w:lang w:val="en-US"/>
+        </w:rPr>
+        <w:t>I would need an</w:t>
+      </w:r>
+      <w:r>
+        <w:rPr>
+          <w:lang w:val="en-US"/>
+        </w:rPr>
+        <w:t xml:space="preserve"> offer letter </w:t>
+      </w:r>
+      <w:r>
+        <w:rPr>
+          <w:lang w:val="en-US"/>
+        </w:rPr>
+        <w:t>with</w:t>
+      </w:r>
+    </w:p>
+    <w:p>
+      <w:pPr>
+        <w:pStyle w:val="ListParagraph"/>
+        <w:numPr>
+          <w:ilvl w:val="0"/>
+          <w:numId w:val="2"/>
+        </w:numPr>
+        <w:tabs>
+          <w:tab w:val="num" w:pos="720"/>
+        </w:tabs>
+        <w:rPr>
+          <w:lang w:val="en-US"/>
+        </w:rPr>
+      </w:pPr>
+      <w:r>
+        <w:rPr>
+          <w:lang w:val="en-US"/>
+        </w:rPr>
+        <w:t>Name of the employer</w:t>
+      </w:r>
+    </w:p>
+    <w:p>
+      <w:pPr>
+        <w:numPr>
+          <w:ilvl w:val="0"/>
+          <w:numId w:val="1"/>
+        </w:numPr>
+        <w:rPr>
+          <w:lang w:val="en-US"/>
+        </w:rPr>
+      </w:pPr>
+      <w:r>
+        <w:rPr>
+          <w:lang w:val="en-US"/>
+        </w:rPr>
+        <w:t>Specific starting and ending dates </w:t>
+      </w:r>
+      <w:r>
+        <w:rPr>
+          <w:lang w:val="en-US"/>
+        </w:rPr>
+        <w:t xml:space="preserve">(The </w:t>
+      </w:r>
+      <w:r>
+        <w:rPr>
+          <w:lang w:val="en-US"/>
+        </w:rPr>
+        <w:t>end date must be no later than September 1</w:t>
+      </w:r>
+      <w:r>
+        <w:rPr>
+          <w:lang w:val="en-US"/>
+        </w:rPr>
+        <w:t>st</w:t>
+      </w:r>
+      <w:r>
+        <w:rPr>
+          <w:lang w:val="en-US"/>
+        </w:rPr>
+        <w:t>)</w:t>
+      </w:r>
+    </w:p>
+    <w:p>
+      <w:pPr>
+        <w:numPr>
+          <w:ilvl w:val="0"/>
+          <w:numId w:val="1"/>
+        </w:numPr>
+        <w:rPr>
+          <w:lang w:val="en-US"/>
+        </w:rPr>
+      </w:pPr>
+      <w:r>
+        <w:rPr>
+          <w:lang w:val="en-US"/>
+        </w:rPr>
+        <w:t>Internship position title</w:t>
+      </w:r>
+    </w:p>
+    <w:p>
+      <w:pPr>
+        <w:numPr>
+          <w:ilvl w:val="0"/>
+          <w:numId w:val="1"/>
+        </w:numPr>
+        <w:rPr>
+          <w:lang w:val="en-US"/>
+        </w:rPr>
+      </w:pPr>
+      <w:r>
+        <w:rPr>
+          <w:lang w:val="en-US"/>
+        </w:rPr>
+        <w:t>A brief description of duties</w:t>
+      </w:r>
+      <w:r>
+        <w:rPr>
+          <w:lang w:val="en-US"/>
+        </w:rPr>
+        <w:t>. (</w:t>
+      </w:r>
+      <w:r>
+        <w:rPr>
+          <w:lang w:val="en-US"/>
+        </w:rPr>
+        <w:t>Since my major is Marketing, it would be great if the description could highlight some connection to marketing</w:t>
+      </w:r>
+      <w:r>
+        <w:rPr>
+          <w:lang w:val="en-US"/>
+        </w:rPr>
+        <w:t>)</w:t>
+      </w:r>
+      <w:r>
+        <w:rPr>
+          <w:lang w:val="en-US"/>
+        </w:rPr>
+        <w:t>.</w:t>
+      </w:r>
+    </w:p>
+    <w:p>
+      <w:pPr>
+        <w:numPr>
+          <w:ilvl w:val="0"/>
+          <w:numId w:val="1"/>
+        </w:numPr>
+        <w:rPr>
+          <w:lang w:val="en-US"/>
+        </w:rPr>
+      </w:pPr>
+      <w:r>
+        <w:rPr>
+          <w:lang w:val="en-US"/>
+        </w:rPr>
+        <w:t>Salary</w:t>
+      </w:r>
+    </w:p>
+    <w:p>
+      <w:pPr>
+        <w:numPr>
+          <w:ilvl w:val="0"/>
+          <w:numId w:val="1"/>
+        </w:numPr>
+        <w:rPr>
+          <w:lang w:val="en-US"/>
+        </w:rPr>
+      </w:pPr>
+      <w:r>
+        <w:rPr>
+          <w:lang w:val="en-US"/>
+        </w:rPr>
+        <w:t>Hours per week</w:t>
+      </w:r>
+    </w:p>
+    <w:p>
+      <w:pPr>
+        <w:numPr>
+          <w:ilvl w:val="0"/>
+          <w:numId w:val="1"/>
+        </w:numPr>
+        <w:rPr>
+          <w:lang w:val="en-US"/>
+        </w:rPr>
+      </w:pPr>
+      <w:r>
+        <w:rPr>
+          <w:lang w:val="en-US"/>
+        </w:rPr>
+        <w:t>Name of the supervisor and their contact information</w:t>
+      </w:r>
+    </w:p>
+    <w:p>
+      <w:pPr>
+        <w:numPr>
+          <w:ilvl w:val="0"/>
+          <w:numId w:val="1"/>
+        </w:numPr>
+        <w:rPr>
+          <w:lang w:val="en-US"/>
+        </w:rPr>
+      </w:pPr>
+      <w:r>
+        <w:rPr>
+          <w:lang w:val="en-US"/>
+        </w:rPr>
+        <w:t>Physical address of the work location</w:t>
+      </w:r>
+    </w:p>
+    <w:p>
+      <w:pPr>
+        <w:rPr>
+          <w:lang w:val="en-US"/>
+        </w:rPr>
+      </w:pPr>
+      <w:r>
+        <w:rPr>
+          <w:lang w:val="en-US"/>
+        </w:rPr>
+        <w:t>Once I receive the offer letter, I will send it to the doctoral office for their review. Please let me know if you need me to provide anything else on my side – I will reply as soon as possible</w:t>
+      </w:r>
+      <w:r>
+        <w:rPr>
+          <w:lang w:val="en-US"/>
+        </w:rPr>
+        <w:t>!</w:t>
+      </w:r>
+    </w:p>
+    <w:p>
+      <w:pPr>
+        <w:rPr>
+          <w:lang w:val="en-US"/>
+        </w:rPr>
+      </w:pPr>
+      <w:r>
+        <w:rPr>
+          <w:lang w:val="en-US"/>
+        </w:rPr>
+        <w:t>Many thanks for your help and h</w:t>
+      </w:r>
+      <w:r>
+        <w:rPr>
+          <w:lang w:val="en-US"/>
+        </w:rPr>
+        <w:t>opefully we can get this done soon</w:t>
+      </w:r>
+      <w:r>
+        <w:rPr>
+          <w:lang w:val="en-US"/>
+        </w:rPr>
+        <w:t>!</w:t>
+      </w:r>
+    </w:p>
+    <w:p>
+      <w:pPr>
+        <w:rPr>
+          <w:lang w:val="en-US"/>
+        </w:rPr>
+      </w:pPr>
+      <w:r>
+        <w:rPr>
+          <w:lang w:val="en-US"/>
+        </w:rPr>
+        <w:t>Best regards,</w:t>
+      </w:r>
+    </w:p>
+    <w:p>
+      <w:pPr>
+        <w:rPr>
+          <w:lang w:val="en-US"/>
+        </w:rPr>
+      </w:pPr>
+      <w:r>
+        <w:rPr>
+          <w:lang w:val="en-US"/>
+        </w:rPr>
+        <w:t>Qiyu</w:t>
+      </w:r>
+    </w:p>
+    <w:p>
+      <w:pPr>
+        <w:rPr>
+          <w:lang w:val="en-US"/>
+        </w:rPr>
+      </w:pPr>
+    </w:p>
+    <w:p>
+      <w:pPr>
+        <w:rPr>
+          <w:lang w:val="en-US"/>
+        </w:rPr>
+      </w:pPr>
+    </w:p>
+    <w:p>
+      <w:pPr>
+        <w:rPr>
+          <w:lang w:val="en-US"/>
+        </w:rPr>
+      </w:pPr>
+    </w:p>
+    <w:p>
+      <w:pPr>
+        <w:rPr>
+          <w:lang w:val="en-US"/>
+        </w:rPr>
+      </w:pPr>
+      <w:r>
+        <w:rPr>
+          <w:lang w:val="en-US"/>
+        </w:rPr>
+        <w:lastRenderedPageBreak/>
+        <w:t>Dear Doctoral Office Team,</w:t>
+      </w:r>
+    </w:p>
+    <w:p>
+      <w:pPr>
+        <w:rPr>
+          <w:lang w:val="en-US"/>
+        </w:rPr>
+      </w:pPr>
+      <w:r>
+        <w:rPr>
+          <w:lang w:val="en-US"/>
+        </w:rPr>
+        <w:t xml:space="preserve">I hope this email finds you well. I </w:t>
+      </w:r>
+      <w:r>
+        <w:rPr>
+          <w:lang w:val="en-US"/>
+        </w:rPr>
+        <w:t xml:space="preserve">am sorry </w:t>
+      </w:r>
+      <w:r>
+        <w:rPr>
+          <w:lang w:val="en-US"/>
+        </w:rPr>
+        <w:t>for taking up your time once agai</w:t>
+      </w:r>
+      <w:r>
+        <w:rPr>
+          <w:lang w:val="en-US"/>
+        </w:rPr>
+        <w:t>n</w:t>
+      </w:r>
+      <w:r>
+        <w:rPr>
+          <w:lang w:val="en-US"/>
+        </w:rPr>
+        <w:t xml:space="preserve">. I </w:t>
+      </w:r>
+      <w:r>
+        <w:rPr>
+          <w:lang w:val="en-US"/>
+        </w:rPr>
+        <w:t xml:space="preserve">wanted </w:t>
+      </w:r>
+      <w:r>
+        <w:rPr>
+          <w:lang w:val="en-US"/>
+        </w:rPr>
+        <w:t>to seek your kind assistance regarding my CPT application, as I have a somewhat tight timeline for my upcoming summer internship.</w:t>
+      </w:r>
+    </w:p>
+    <w:p>
+      <w:pPr>
+        <w:rPr>
+          <w:lang w:val="en-US"/>
+        </w:rPr>
+      </w:pPr>
+      <w:r>
+        <w:rPr>
+          <w:lang w:val="en-US"/>
+        </w:rPr>
+        <w:t>I am expecting to receive the offer letter from the HR shortly. In the meantime, I would be</w:t>
+      </w:r>
+      <w:r>
+        <w:rPr>
+          <w:lang w:val="en-US"/>
+        </w:rPr>
+        <w:t xml:space="preserve"> </w:t>
+      </w:r>
+      <w:r>
+        <w:rPr>
+          <w:lang w:val="en-US"/>
+        </w:rPr>
+        <w:t>grateful if you could help clarify a few points so that I can prepare all the necessary materials in advance:</w:t>
+      </w:r>
+    </w:p>
+    <w:p>
+      <w:pPr>
+        <w:pStyle w:val="ListParagraph"/>
+        <w:numPr>
+          <w:ilvl w:val="0"/>
+          <w:numId w:val="4"/>
+        </w:numPr>
+        <w:rPr>
+          <w:lang w:val="en-US"/>
+        </w:rPr>
+      </w:pPr>
+      <w:r>
+        <w:rPr>
+          <w:lang w:val="en-US"/>
+        </w:rPr>
+        <w:t xml:space="preserve">I need to meet with my academic advisor for </w:t>
+      </w:r>
+      <w:r>
+        <w:rPr>
+          <w:lang w:val="en-US"/>
+        </w:rPr>
+        <w:t xml:space="preserve">CPT </w:t>
+      </w:r>
+      <w:r>
+        <w:rPr>
+          <w:lang w:val="en-US"/>
+        </w:rPr>
+        <w:t>course registration. Could you let me know who I should contact for this</w:t>
+      </w:r>
+      <w:r>
+        <w:rPr>
+          <w:lang w:val="en-US"/>
+        </w:rPr>
+        <w:t xml:space="preserve"> in stern</w:t>
+      </w:r>
+      <w:r>
+        <w:rPr>
+          <w:lang w:val="en-US"/>
+        </w:rPr>
+        <w:t>?</w:t>
+      </w:r>
+    </w:p>
+    <w:p>
+      <w:pPr>
+        <w:pStyle w:val="ListParagraph"/>
+        <w:numPr>
+          <w:ilvl w:val="0"/>
+          <w:numId w:val="4"/>
+        </w:numPr>
+        <w:rPr>
+          <w:lang w:val="en-US"/>
+        </w:rPr>
+      </w:pPr>
+      <w:r>
+        <w:rPr>
+          <w:lang w:val="en-US"/>
+        </w:rPr>
+        <w:t>Approval Process - Could you clarify what form the approval (from both the PhD coordinator and advisor) should take, e.g., an email confirmation? Also, since I do not have a formal advisor yet, would approval from my research practicum supervisor be acceptable?</w:t>
+      </w:r>
+    </w:p>
+    <w:p>
+      <w:pPr>
+        <w:pStyle w:val="ListParagraph"/>
+        <w:numPr>
+          <w:ilvl w:val="0"/>
+          <w:numId w:val="4"/>
+        </w:numPr>
+        <w:rPr>
+          <w:lang w:val="en-US"/>
+        </w:rPr>
+      </w:pPr>
+      <w:r>
+        <w:t xml:space="preserve"> As this project is also part of my own research (co-authored with faculty in our marketing department), I am concerned that I may not be able to complete all the analysis within the summer. Would it be possible for me to continue contributing to the project after the fall semester begins, perhaps in the form of a part</w:t>
+      </w:r>
+      <w:r>
+        <w:noBreakHyphen/>
+        <w:t>time internship (with CPT)?</w:t>
+      </w:r>
+      <w:r>
+        <w:t xml:space="preserve"> Is there any hourly restrictions, and should I form another CPT separately or should I use the same one.</w:t>
+      </w:r>
+      <w:r>
+        <w:t xml:space="preserve"> </w:t>
+      </w:r>
+    </w:p>
+    <w:p>
+      <w:pPr>
+        <w:rPr>
+          <w:lang w:val="en-US"/>
+        </w:rPr>
+      </w:pPr>
+      <w:r>
+        <w:rPr>
+          <w:lang w:val="en-US"/>
+        </w:rPr>
+        <w:t>I truly appreciate your time and patience in reviewing my inquiries, and I completely understand that such processes may take time. Please do not hesitate to let me know if there is any additional information or documentation I need to provide on my end. I am more than happy to follow up promptly.</w:t>
+      </w:r>
+    </w:p>
+    <w:p>
+      <w:pPr>
+        <w:rPr>
+          <w:lang w:val="en-US"/>
+        </w:rPr>
+      </w:pPr>
+      <w:r>
+        <w:rPr>
+          <w:lang w:val="en-US"/>
+        </w:rPr>
+        <w:t>Thank you again for your kind assistance</w:t>
+      </w:r>
+      <w:r>
+        <w:rPr>
+          <w:lang w:val="en-US"/>
+        </w:rPr>
+        <w:t>!</w:t>
+      </w:r>
+      <w:r>
+        <w:rPr>
+          <w:lang w:val="en-US"/>
+        </w:rPr>
+        <w:t xml:space="preserve"> I look forward to your reply at your earliest convenience.</w:t>
+      </w:r>
+    </w:p>
+    <w:p>
+      <w:pPr>
+        <w:rPr>
+          <w:lang w:val="en-US"/>
+        </w:rPr>
+      </w:pPr>
+      <w:r>
+        <w:rPr>
+          <w:lang w:val="en-US"/>
+        </w:rPr>
+        <w:t>Best regards,</w:t>
+      </w:r>
+    </w:p>
+    <w:p>
+      <w:pPr>
+        <w:rPr>
+          <w:lang w:val="en-US"/>
+        </w:rPr>
+      </w:pPr>
+      <w:r>
+        <w:rPr>
+          <w:lang w:val="en-US"/>
+        </w:rPr>
+        <w:t>Qiyu</w:t>
+      </w:r>
+    </w:p>
+    <w:p>
+      <w:pPr>
+        <w:rPr>
+          <w:lang w:val="en-US"/>
+        </w:rPr>
+      </w:pPr>
+    </w:p>
+    <w:p>
+      <w:pPr>
+        <w:rPr>
+          <w:lang w:val="en-US"/>
+        </w:rPr>
+      </w:pPr>
     </w:p>
     <w:sectPr>
       <w:pgSz w:w="11906" w:h="16838"/>
@@ -1123,6 +1451,486 @@
     </w:sectPr>
   </w:body>
 </w:document>
+</file>
+
+<file path=word/numbering.xml><?xml version="1.0" encoding="utf-8"?>
+<w:numbering xmlns:wpc="http://schemas.microsoft.com/office/word/2010/wordprocessingCanvas" xmlns:cx="http://schemas.microsoft.com/office/drawing/2014/chartex" xmlns:cx1="http://schemas.microsoft.com/office/drawing/2015/9/8/chartex" xmlns:cx2="http://schemas.microsoft.com/office/drawing/2015/10/21/chartex" xmlns:cx3="http://schemas.microsoft.com/office/drawing/2016/5/9/chartex" xmlns:cx4="http://schemas.microsoft.com/office/drawing/2016/5/10/chartex" xmlns:cx5="http://schemas.microsoft.com/office/drawing/2016/5/11/chartex" xmlns:cx6="http://schemas.microsoft.com/office/drawing/2016/5/12/chartex" xmlns:cx7="http://schemas.microsoft.com/office/drawing/2016/5/13/chartex" xmlns:cx8="http://schemas.microsoft.com/office/drawing/2016/5/14/chartex" xmlns:mc="http://schemas.openxmlformats.org/markup-compatibility/2006" xmlns:aink="http://schemas.microsoft.com/office/drawing/2016/ink" xmlns:am3d="http://schemas.microsoft.com/office/drawing/2017/model3d" xmlns:o="urn:schemas-microsoft-com:office:office" xmlns:oel="http://schemas.microsoft.com/office/2019/extlst" xmlns:r="http://schemas.openxmlformats.org/officeDocument/2006/relationships" xmlns:m="http://schemas.openxmlformats.org/officeDocument/2006/math" xmlns:v="urn:schemas-microsoft-com:vml" xmlns:wp14="http://schemas.microsoft.com/office/word/2010/wordprocessingDrawing" xmlns:wp="http://schemas.openxmlformats.org/drawingml/2006/wordprocessingDrawing" xmlns:w10="urn:schemas-microsoft-com:office:word" xmlns:w="http://schemas.openxmlformats.org/wordprocessingml/2006/main" xmlns:w14="http://schemas.microsoft.com/office/word/2010/wordml" xmlns:w15="http://schemas.microsoft.com/office/word/2012/wordml" xmlns:w16cex="http://schemas.microsoft.com/office/word/2018/wordml/cex" xmlns:w16cid="http://schemas.microsoft.com/office/word/2016/wordml/cid" xmlns:w16="http://schemas.microsoft.com/office/word/2018/wordml" xmlns:w16du="http://schemas.microsoft.com/office/word/2023/wordml/word16du" xmlns:w16sdtdh="http://schemas.microsoft.com/office/word/2020/wordml/sdtdatahash" xmlns:w16se="http://schemas.microsoft.com/office/word/2015/wordml/symex" xmlns:wpg="http://schemas.microsoft.com/office/word/2010/wordprocessingGroup" xmlns:wpi="http://schemas.microsoft.com/office/word/2010/wordprocessingInk" xmlns:wne="http://schemas.microsoft.com/office/word/2006/wordml" xmlns:wps="http://schemas.microsoft.com/office/word/2010/wordprocessingShape" mc:Ignorable="w14 w15 w16se w16cid w16 w16cex w16sdtdh w16du wp14">
+  <w:abstractNum w:abstractNumId="0" w15:restartNumberingAfterBreak="0">
+    <w:nsid w:val="5CAE4661"/>
+    <w:multiLevelType w:val="hybridMultilevel"/>
+    <w:tmpl w:val="32507D48"/>
+    <w:lvl w:ilvl="0" w:tplc="0409000F">
+      <w:start w:val="1"/>
+      <w:numFmt w:val="decimal"/>
+      <w:lvlText w:val="%1."/>
+      <w:lvlJc w:val="left"/>
+      <w:pPr>
+        <w:ind w:left="720" w:hanging="360"/>
+      </w:pPr>
+      <w:rPr>
+        <w:rFonts w:hint="default"/>
+      </w:rPr>
+    </w:lvl>
+    <w:lvl w:ilvl="1" w:tplc="04090019" w:tentative="1">
+      <w:start w:val="1"/>
+      <w:numFmt w:val="lowerLetter"/>
+      <w:lvlText w:val="%2."/>
+      <w:lvlJc w:val="left"/>
+      <w:pPr>
+        <w:ind w:left="1440" w:hanging="360"/>
+      </w:pPr>
+    </w:lvl>
+    <w:lvl w:ilvl="2" w:tplc="0409001B" w:tentative="1">
+      <w:start w:val="1"/>
+      <w:numFmt w:val="lowerRoman"/>
+      <w:lvlText w:val="%3."/>
+      <w:lvlJc w:val="right"/>
+      <w:pPr>
+        <w:ind w:left="2160" w:hanging="180"/>
+      </w:pPr>
+    </w:lvl>
+    <w:lvl w:ilvl="3" w:tplc="0409000F" w:tentative="1">
+      <w:start w:val="1"/>
+      <w:numFmt w:val="decimal"/>
+      <w:lvlText w:val="%4."/>
+      <w:lvlJc w:val="left"/>
+      <w:pPr>
+        <w:ind w:left="2880" w:hanging="360"/>
+      </w:pPr>
+    </w:lvl>
+    <w:lvl w:ilvl="4" w:tplc="04090019" w:tentative="1">
+      <w:start w:val="1"/>
+      <w:numFmt w:val="lowerLetter"/>
+      <w:lvlText w:val="%5."/>
+      <w:lvlJc w:val="left"/>
+      <w:pPr>
+        <w:ind w:left="3600" w:hanging="360"/>
+      </w:pPr>
+    </w:lvl>
+    <w:lvl w:ilvl="5" w:tplc="0409001B" w:tentative="1">
+      <w:start w:val="1"/>
+      <w:numFmt w:val="lowerRoman"/>
+      <w:lvlText w:val="%6."/>
+      <w:lvlJc w:val="right"/>
+      <w:pPr>
+        <w:ind w:left="4320" w:hanging="180"/>
+      </w:pPr>
+    </w:lvl>
+    <w:lvl w:ilvl="6" w:tplc="0409000F" w:tentative="1">
+      <w:start w:val="1"/>
+      <w:numFmt w:val="decimal"/>
+      <w:lvlText w:val="%7."/>
+      <w:lvlJc w:val="left"/>
+      <w:pPr>
+        <w:ind w:left="5040" w:hanging="360"/>
+      </w:pPr>
+    </w:lvl>
+    <w:lvl w:ilvl="7" w:tplc="04090019" w:tentative="1">
+      <w:start w:val="1"/>
+      <w:numFmt w:val="lowerLetter"/>
+      <w:lvlText w:val="%8."/>
+      <w:lvlJc w:val="left"/>
+      <w:pPr>
+        <w:ind w:left="5760" w:hanging="360"/>
+      </w:pPr>
+    </w:lvl>
+    <w:lvl w:ilvl="8" w:tplc="0409001B" w:tentative="1">
+      <w:start w:val="1"/>
+      <w:numFmt w:val="lowerRoman"/>
+      <w:lvlText w:val="%9."/>
+      <w:lvlJc w:val="right"/>
+      <w:pPr>
+        <w:ind w:left="6480" w:hanging="180"/>
+      </w:pPr>
+    </w:lvl>
+  </w:abstractNum>
+  <w:abstractNum w:abstractNumId="1" w15:restartNumberingAfterBreak="0">
+    <w:nsid w:val="5CF61253"/>
+    <w:multiLevelType w:val="multilevel"/>
+    <w:tmpl w:val="52727A68"/>
+    <w:lvl w:ilvl="0">
+      <w:start w:val="1"/>
+      <w:numFmt w:val="bullet"/>
+      <w:lvlText w:val=""/>
+      <w:lvlJc w:val="left"/>
+      <w:pPr>
+        <w:tabs>
+          <w:tab w:val="num" w:pos="720"/>
+        </w:tabs>
+        <w:ind w:left="720" w:hanging="360"/>
+      </w:pPr>
+      <w:rPr>
+        <w:rFonts w:ascii="Symbol" w:hAnsi="Symbol" w:hint="default"/>
+        <w:sz w:val="20"/>
+      </w:rPr>
+    </w:lvl>
+    <w:lvl w:ilvl="1" w:tentative="1">
+      <w:start w:val="1"/>
+      <w:numFmt w:val="bullet"/>
+      <w:lvlText w:val="o"/>
+      <w:lvlJc w:val="left"/>
+      <w:pPr>
+        <w:tabs>
+          <w:tab w:val="num" w:pos="1440"/>
+        </w:tabs>
+        <w:ind w:left="1440" w:hanging="360"/>
+      </w:pPr>
+      <w:rPr>
+        <w:rFonts w:ascii="Courier New" w:hAnsi="Courier New" w:hint="default"/>
+        <w:sz w:val="20"/>
+      </w:rPr>
+    </w:lvl>
+    <w:lvl w:ilvl="2" w:tentative="1">
+      <w:start w:val="1"/>
+      <w:numFmt w:val="bullet"/>
+      <w:lvlText w:val=""/>
+      <w:lvlJc w:val="left"/>
+      <w:pPr>
+        <w:tabs>
+          <w:tab w:val="num" w:pos="2160"/>
+        </w:tabs>
+        <w:ind w:left="2160" w:hanging="360"/>
+      </w:pPr>
+      <w:rPr>
+        <w:rFonts w:ascii="Wingdings" w:hAnsi="Wingdings" w:hint="default"/>
+        <w:sz w:val="20"/>
+      </w:rPr>
+    </w:lvl>
+    <w:lvl w:ilvl="3" w:tentative="1">
+      <w:start w:val="1"/>
+      <w:numFmt w:val="bullet"/>
+      <w:lvlText w:val=""/>
+      <w:lvlJc w:val="left"/>
+      <w:pPr>
+        <w:tabs>
+          <w:tab w:val="num" w:pos="2880"/>
+        </w:tabs>
+        <w:ind w:left="2880" w:hanging="360"/>
+      </w:pPr>
+      <w:rPr>
+        <w:rFonts w:ascii="Wingdings" w:hAnsi="Wingdings" w:hint="default"/>
+        <w:sz w:val="20"/>
+      </w:rPr>
+    </w:lvl>
+    <w:lvl w:ilvl="4" w:tentative="1">
+      <w:start w:val="1"/>
+      <w:numFmt w:val="bullet"/>
+      <w:lvlText w:val=""/>
+      <w:lvlJc w:val="left"/>
+      <w:pPr>
+        <w:tabs>
+          <w:tab w:val="num" w:pos="3600"/>
+        </w:tabs>
+        <w:ind w:left="3600" w:hanging="360"/>
+      </w:pPr>
+      <w:rPr>
+        <w:rFonts w:ascii="Wingdings" w:hAnsi="Wingdings" w:hint="default"/>
+        <w:sz w:val="20"/>
+      </w:rPr>
+    </w:lvl>
+    <w:lvl w:ilvl="5" w:tentative="1">
+      <w:start w:val="1"/>
+      <w:numFmt w:val="bullet"/>
+      <w:lvlText w:val=""/>
+      <w:lvlJc w:val="left"/>
+      <w:pPr>
+        <w:tabs>
+          <w:tab w:val="num" w:pos="4320"/>
+        </w:tabs>
+        <w:ind w:left="4320" w:hanging="360"/>
+      </w:pPr>
+      <w:rPr>
+        <w:rFonts w:ascii="Wingdings" w:hAnsi="Wingdings" w:hint="default"/>
+        <w:sz w:val="20"/>
+      </w:rPr>
+    </w:lvl>
+    <w:lvl w:ilvl="6" w:tentative="1">
+      <w:start w:val="1"/>
+      <w:numFmt w:val="bullet"/>
+      <w:lvlText w:val=""/>
+      <w:lvlJc w:val="left"/>
+      <w:pPr>
+        <w:tabs>
+          <w:tab w:val="num" w:pos="5040"/>
+        </w:tabs>
+        <w:ind w:left="5040" w:hanging="360"/>
+      </w:pPr>
+      <w:rPr>
+        <w:rFonts w:ascii="Wingdings" w:hAnsi="Wingdings" w:hint="default"/>
+        <w:sz w:val="20"/>
+      </w:rPr>
+    </w:lvl>
+    <w:lvl w:ilvl="7" w:tentative="1">
+      <w:start w:val="1"/>
+      <w:numFmt w:val="bullet"/>
+      <w:lvlText w:val=""/>
+      <w:lvlJc w:val="left"/>
+      <w:pPr>
+        <w:tabs>
+          <w:tab w:val="num" w:pos="5760"/>
+        </w:tabs>
+        <w:ind w:left="5760" w:hanging="360"/>
+      </w:pPr>
+      <w:rPr>
+        <w:rFonts w:ascii="Wingdings" w:hAnsi="Wingdings" w:hint="default"/>
+        <w:sz w:val="20"/>
+      </w:rPr>
+    </w:lvl>
+    <w:lvl w:ilvl="8" w:tentative="1">
+      <w:start w:val="1"/>
+      <w:numFmt w:val="bullet"/>
+      <w:lvlText w:val=""/>
+      <w:lvlJc w:val="left"/>
+      <w:pPr>
+        <w:tabs>
+          <w:tab w:val="num" w:pos="6480"/>
+        </w:tabs>
+        <w:ind w:left="6480" w:hanging="360"/>
+      </w:pPr>
+      <w:rPr>
+        <w:rFonts w:ascii="Wingdings" w:hAnsi="Wingdings" w:hint="default"/>
+        <w:sz w:val="20"/>
+      </w:rPr>
+    </w:lvl>
+  </w:abstractNum>
+  <w:abstractNum w:abstractNumId="2" w15:restartNumberingAfterBreak="0">
+    <w:nsid w:val="73320990"/>
+    <w:multiLevelType w:val="hybridMultilevel"/>
+    <w:tmpl w:val="E132D8F6"/>
+    <w:lvl w:ilvl="0" w:tplc="87B6C8B2">
+      <w:numFmt w:val="bullet"/>
+      <w:lvlText w:val="-"/>
+      <w:lvlJc w:val="left"/>
+      <w:pPr>
+        <w:ind w:left="720" w:hanging="360"/>
+      </w:pPr>
+      <w:rPr>
+        <w:rFonts w:ascii="Aptos" w:eastAsiaTheme="minorEastAsia" w:hAnsi="Aptos" w:cstheme="minorBidi" w:hint="default"/>
+      </w:rPr>
+    </w:lvl>
+    <w:lvl w:ilvl="1" w:tplc="04090003" w:tentative="1">
+      <w:start w:val="1"/>
+      <w:numFmt w:val="bullet"/>
+      <w:lvlText w:val="o"/>
+      <w:lvlJc w:val="left"/>
+      <w:pPr>
+        <w:ind w:left="1440" w:hanging="360"/>
+      </w:pPr>
+      <w:rPr>
+        <w:rFonts w:ascii="Courier New" w:hAnsi="Courier New" w:cs="Courier New" w:hint="default"/>
+      </w:rPr>
+    </w:lvl>
+    <w:lvl w:ilvl="2" w:tplc="04090005" w:tentative="1">
+      <w:start w:val="1"/>
+      <w:numFmt w:val="bullet"/>
+      <w:lvlText w:val=""/>
+      <w:lvlJc w:val="left"/>
+      <w:pPr>
+        <w:ind w:left="2160" w:hanging="360"/>
+      </w:pPr>
+      <w:rPr>
+        <w:rFonts w:ascii="Wingdings" w:hAnsi="Wingdings" w:hint="default"/>
+      </w:rPr>
+    </w:lvl>
+    <w:lvl w:ilvl="3" w:tplc="04090001" w:tentative="1">
+      <w:start w:val="1"/>
+      <w:numFmt w:val="bullet"/>
+      <w:lvlText w:val=""/>
+      <w:lvlJc w:val="left"/>
+      <w:pPr>
+        <w:ind w:left="2880" w:hanging="360"/>
+      </w:pPr>
+      <w:rPr>
+        <w:rFonts w:ascii="Symbol" w:hAnsi="Symbol" w:hint="default"/>
+      </w:rPr>
+    </w:lvl>
+    <w:lvl w:ilvl="4" w:tplc="04090003" w:tentative="1">
+      <w:start w:val="1"/>
+      <w:numFmt w:val="bullet"/>
+      <w:lvlText w:val="o"/>
+      <w:lvlJc w:val="left"/>
+      <w:pPr>
+        <w:ind w:left="3600" w:hanging="360"/>
+      </w:pPr>
+      <w:rPr>
+        <w:rFonts w:ascii="Courier New" w:hAnsi="Courier New" w:cs="Courier New" w:hint="default"/>
+      </w:rPr>
+    </w:lvl>
+    <w:lvl w:ilvl="5" w:tplc="04090005" w:tentative="1">
+      <w:start w:val="1"/>
+      <w:numFmt w:val="bullet"/>
+      <w:lvlText w:val=""/>
+      <w:lvlJc w:val="left"/>
+      <w:pPr>
+        <w:ind w:left="4320" w:hanging="360"/>
+      </w:pPr>
+      <w:rPr>
+        <w:rFonts w:ascii="Wingdings" w:hAnsi="Wingdings" w:hint="default"/>
+      </w:rPr>
+    </w:lvl>
+    <w:lvl w:ilvl="6" w:tplc="04090001" w:tentative="1">
+      <w:start w:val="1"/>
+      <w:numFmt w:val="bullet"/>
+      <w:lvlText w:val=""/>
+      <w:lvlJc w:val="left"/>
+      <w:pPr>
+        <w:ind w:left="5040" w:hanging="360"/>
+      </w:pPr>
+      <w:rPr>
+        <w:rFonts w:ascii="Symbol" w:hAnsi="Symbol" w:hint="default"/>
+      </w:rPr>
+    </w:lvl>
+    <w:lvl w:ilvl="7" w:tplc="04090003" w:tentative="1">
+      <w:start w:val="1"/>
+      <w:numFmt w:val="bullet"/>
+      <w:lvlText w:val="o"/>
+      <w:lvlJc w:val="left"/>
+      <w:pPr>
+        <w:ind w:left="5760" w:hanging="360"/>
+      </w:pPr>
+      <w:rPr>
+        <w:rFonts w:ascii="Courier New" w:hAnsi="Courier New" w:cs="Courier New" w:hint="default"/>
+      </w:rPr>
+    </w:lvl>
+    <w:lvl w:ilvl="8" w:tplc="04090005" w:tentative="1">
+      <w:start w:val="1"/>
+      <w:numFmt w:val="bullet"/>
+      <w:lvlText w:val=""/>
+      <w:lvlJc w:val="left"/>
+      <w:pPr>
+        <w:ind w:left="6480" w:hanging="360"/>
+      </w:pPr>
+      <w:rPr>
+        <w:rFonts w:ascii="Wingdings" w:hAnsi="Wingdings" w:hint="default"/>
+      </w:rPr>
+    </w:lvl>
+  </w:abstractNum>
+  <w:abstractNum w:abstractNumId="3" w15:restartNumberingAfterBreak="0">
+    <w:nsid w:val="757A14FD"/>
+    <w:multiLevelType w:val="multilevel"/>
+    <w:tmpl w:val="CB946BFC"/>
+    <w:lvl w:ilvl="0">
+      <w:start w:val="1"/>
+      <w:numFmt w:val="decimal"/>
+      <w:lvlText w:val="%1."/>
+      <w:lvlJc w:val="left"/>
+      <w:pPr>
+        <w:tabs>
+          <w:tab w:val="num" w:pos="720"/>
+        </w:tabs>
+        <w:ind w:left="720" w:hanging="360"/>
+      </w:pPr>
+    </w:lvl>
+    <w:lvl w:ilvl="1" w:tentative="1">
+      <w:start w:val="1"/>
+      <w:numFmt w:val="decimal"/>
+      <w:lvlText w:val="%2."/>
+      <w:lvlJc w:val="left"/>
+      <w:pPr>
+        <w:tabs>
+          <w:tab w:val="num" w:pos="1440"/>
+        </w:tabs>
+        <w:ind w:left="1440" w:hanging="360"/>
+      </w:pPr>
+    </w:lvl>
+    <w:lvl w:ilvl="2" w:tentative="1">
+      <w:start w:val="1"/>
+      <w:numFmt w:val="decimal"/>
+      <w:lvlText w:val="%3."/>
+      <w:lvlJc w:val="left"/>
+      <w:pPr>
+        <w:tabs>
+          <w:tab w:val="num" w:pos="2160"/>
+        </w:tabs>
+        <w:ind w:left="2160" w:hanging="360"/>
+      </w:pPr>
+    </w:lvl>
+    <w:lvl w:ilvl="3" w:tentative="1">
+      <w:start w:val="1"/>
+      <w:numFmt w:val="decimal"/>
+      <w:lvlText w:val="%4."/>
+      <w:lvlJc w:val="left"/>
+      <w:pPr>
+        <w:tabs>
+          <w:tab w:val="num" w:pos="2880"/>
+        </w:tabs>
+        <w:ind w:left="2880" w:hanging="360"/>
+      </w:pPr>
+    </w:lvl>
+    <w:lvl w:ilvl="4" w:tentative="1">
+      <w:start w:val="1"/>
+      <w:numFmt w:val="decimal"/>
+      <w:lvlText w:val="%5."/>
+      <w:lvlJc w:val="left"/>
+      <w:pPr>
+        <w:tabs>
+          <w:tab w:val="num" w:pos="3600"/>
+        </w:tabs>
+        <w:ind w:left="3600" w:hanging="360"/>
+      </w:pPr>
+    </w:lvl>
+    <w:lvl w:ilvl="5" w:tentative="1">
+      <w:start w:val="1"/>
+      <w:numFmt w:val="decimal"/>
+      <w:lvlText w:val="%6."/>
+      <w:lvlJc w:val="left"/>
+      <w:pPr>
+        <w:tabs>
+          <w:tab w:val="num" w:pos="4320"/>
+        </w:tabs>
+        <w:ind w:left="4320" w:hanging="360"/>
+      </w:pPr>
+    </w:lvl>
+    <w:lvl w:ilvl="6" w:tentative="1">
+      <w:start w:val="1"/>
+      <w:numFmt w:val="decimal"/>
+      <w:lvlText w:val="%7."/>
+      <w:lvlJc w:val="left"/>
+      <w:pPr>
+        <w:tabs>
+          <w:tab w:val="num" w:pos="5040"/>
+        </w:tabs>
+        <w:ind w:left="5040" w:hanging="360"/>
+      </w:pPr>
+    </w:lvl>
+    <w:lvl w:ilvl="7" w:tentative="1">
+      <w:start w:val="1"/>
+      <w:numFmt w:val="decimal"/>
+      <w:lvlText w:val="%8."/>
+      <w:lvlJc w:val="left"/>
+      <w:pPr>
+        <w:tabs>
+          <w:tab w:val="num" w:pos="5760"/>
+        </w:tabs>
+        <w:ind w:left="5760" w:hanging="360"/>
+      </w:pPr>
+    </w:lvl>
+    <w:lvl w:ilvl="8" w:tentative="1">
+      <w:start w:val="1"/>
+      <w:numFmt w:val="decimal"/>
+      <w:lvlText w:val="%9."/>
+      <w:lvlJc w:val="left"/>
+      <w:pPr>
+        <w:tabs>
+          <w:tab w:val="num" w:pos="6480"/>
+        </w:tabs>
+        <w:ind w:left="6480" w:hanging="360"/>
+      </w:pPr>
+    </w:lvl>
+  </w:abstractNum>
+  <w:num w:numId="1" w16cid:durableId="728309648">
+    <w:abstractNumId w:val="1"/>
+  </w:num>
+  <w:num w:numId="2" w16cid:durableId="882405431">
+    <w:abstractNumId w:val="2"/>
+  </w:num>
+  <w:num w:numId="3" w16cid:durableId="70583068">
+    <w:abstractNumId w:val="3"/>
+  </w:num>
+  <w:num w:numId="4" w16cid:durableId="42415357">
+    <w:abstractNumId w:val="0"/>
+  </w:num>
+</w:numbering>
 </file>
 
 <file path=word/styles.xml><?xml version="1.0" encoding="utf-8"?>
@@ -1728,7 +2536,6 @@
   <w:style w:type="character" w:default="1" w:styleId="DefaultParagraphFont">
     <w:name w:val="Default Paragraph Font"/>
     <w:uiPriority w:val="1"/>
-    <w:semiHidden/>
     <w:unhideWhenUsed/>
   </w:style>
   <w:style w:type="table" w:default="1" w:styleId="TableNormal">

</xml_diff>